<commit_message>
materi tagged template literal
</commit_message>
<xml_diff>
--- a/materi-js-wpu (Autosaved).docx
+++ b/materi-js-wpu (Autosaved).docx
@@ -6196,8 +6196,6 @@
           <w:szCs w:val="28"/>
         </w:rPr>
       </w:pPr>
-      <w:bookmarkStart w:id="0" w:name="_GoBack"/>
-      <w:bookmarkEnd w:id="0"/>
       <w:r>
         <w:rPr>
           <w:rFonts w:ascii="Arial Black" w:hAnsi="Arial Black"/>
@@ -15370,62 +15368,30 @@
         </w:rPr>
         <w:t>Mudah di pahami</w:t>
       </w:r>
-    </w:p>
-    <w:p>
-      <w:pPr>
-        <w:pStyle w:val="ListParagraph"/>
-        <w:ind w:left="1440"/>
-        <w:rPr>
-          <w:rFonts w:ascii="Arial Black" w:hAnsi="Arial Black"/>
-          <w:sz w:val="28"/>
-          <w:szCs w:val="28"/>
-        </w:rPr>
-      </w:pPr>
-    </w:p>
-    <w:p>
-      <w:pPr>
-        <w:pStyle w:val="ListParagraph"/>
-        <w:ind w:left="1800"/>
-        <w:rPr>
-          <w:rFonts w:ascii="Arial Black" w:hAnsi="Arial Black"/>
-          <w:color w:val="FF0000"/>
-          <w:sz w:val="28"/>
-          <w:szCs w:val="28"/>
-        </w:rPr>
-      </w:pPr>
-    </w:p>
-    <w:p>
-      <w:pPr>
-        <w:rPr>
-          <w:rFonts w:ascii="Arial Black" w:hAnsi="Arial Black"/>
-          <w:sz w:val="28"/>
-          <w:szCs w:val="28"/>
-        </w:rPr>
-      </w:pPr>
-    </w:p>
-    <w:p>
-      <w:pPr>
-        <w:rPr>
-          <w:rFonts w:ascii="Arial Black" w:hAnsi="Arial Black"/>
-          <w:sz w:val="28"/>
-          <w:szCs w:val="28"/>
-        </w:rPr>
-      </w:pPr>
-    </w:p>
-    <w:p>
-      <w:pPr>
-        <w:rPr>
-          <w:rFonts w:ascii="Arial Black" w:hAnsi="Arial Black"/>
-          <w:sz w:val="28"/>
-          <w:szCs w:val="28"/>
-        </w:rPr>
-      </w:pPr>
-      <w:r>
-        <w:rPr>
-          <w:rFonts w:ascii="Arial Black" w:hAnsi="Arial Black"/>
-          <w:sz w:val="28"/>
-          <w:szCs w:val="28"/>
-        </w:rPr>
+      <w:r>
+        <w:rPr>
+          <w:rFonts w:ascii="Arial Black" w:hAnsi="Arial Black"/>
+          <w:sz w:val="40"/>
+          <w:szCs w:val="40"/>
+        </w:rPr>
+        <w:tab/>
+      </w:r>
+    </w:p>
+    <w:p>
+      <w:pPr>
+        <w:rPr>
+          <w:rFonts w:ascii="Arial Black" w:hAnsi="Arial Black"/>
+          <w:sz w:val="28"/>
+          <w:szCs w:val="28"/>
+        </w:rPr>
+      </w:pPr>
+      <w:r>
+        <w:rPr>
+          <w:rFonts w:ascii="Arial Black" w:hAnsi="Arial Black"/>
+          <w:sz w:val="28"/>
+          <w:szCs w:val="28"/>
+        </w:rPr>
+        <w:lastRenderedPageBreak/>
         <w:t xml:space="preserve">FUNCTION EXSPRESION </w:t>
       </w:r>
     </w:p>
@@ -15734,7 +15700,6 @@
           <w:sz w:val="28"/>
           <w:szCs w:val="28"/>
         </w:rPr>
-        <w:lastRenderedPageBreak/>
         <w:t>Di dalam pemograman, array adalah tipe data yang di gunakan untuk mendiskripsikan kumpulan elemen ( nilai / variable ), yang tiap tiap elemenya memiliki index</w:t>
       </w:r>
     </w:p>
@@ -15764,6 +15729,7 @@
           <w:sz w:val="28"/>
           <w:szCs w:val="28"/>
         </w:rPr>
+        <w:lastRenderedPageBreak/>
         <w:t xml:space="preserve">Contoh : </w:t>
       </w:r>
       <w:r>
@@ -16198,50 +16164,50 @@
           <w:sz w:val="28"/>
           <w:szCs w:val="28"/>
         </w:rPr>
+        <w:t xml:space="preserve">Key anda value pair </w:t>
+      </w:r>
+    </w:p>
+    <w:p>
+      <w:pPr>
+        <w:rPr>
+          <w:rFonts w:ascii="Arial Black" w:hAnsi="Arial Black"/>
+          <w:sz w:val="28"/>
+          <w:szCs w:val="28"/>
+        </w:rPr>
+      </w:pPr>
+      <w:r>
+        <w:rPr>
+          <w:rFonts w:ascii="Arial Black" w:hAnsi="Arial Black"/>
+          <w:sz w:val="28"/>
+          <w:szCs w:val="28"/>
+        </w:rPr>
+        <w:t>Pada saat membuat array bayangkan saja kalian membuat sebuah kotak, yang tiap tiap kotaknya memiliki angka dan pasti urutan angkanya dimulai dari angka 0</w:t>
+      </w:r>
+    </w:p>
+    <w:p>
+      <w:pPr>
+        <w:rPr>
+          <w:rFonts w:ascii="Arial Black" w:hAnsi="Arial Black"/>
+          <w:sz w:val="28"/>
+          <w:szCs w:val="28"/>
+        </w:rPr>
+      </w:pPr>
+    </w:p>
+    <w:p>
+      <w:pPr>
+        <w:rPr>
+          <w:rFonts w:ascii="Arial Black" w:hAnsi="Arial Black"/>
+          <w:sz w:val="28"/>
+          <w:szCs w:val="28"/>
+        </w:rPr>
+      </w:pPr>
+      <w:r>
+        <w:rPr>
+          <w:rFonts w:ascii="Arial Black" w:hAnsi="Arial Black"/>
+          <w:sz w:val="28"/>
+          <w:szCs w:val="28"/>
+        </w:rPr>
         <w:lastRenderedPageBreak/>
-        <w:t xml:space="preserve">Key anda value pair </w:t>
-      </w:r>
-    </w:p>
-    <w:p>
-      <w:pPr>
-        <w:rPr>
-          <w:rFonts w:ascii="Arial Black" w:hAnsi="Arial Black"/>
-          <w:sz w:val="28"/>
-          <w:szCs w:val="28"/>
-        </w:rPr>
-      </w:pPr>
-      <w:r>
-        <w:rPr>
-          <w:rFonts w:ascii="Arial Black" w:hAnsi="Arial Black"/>
-          <w:sz w:val="28"/>
-          <w:szCs w:val="28"/>
-        </w:rPr>
-        <w:t>Pada saat membuat array bayangkan saja kalian membuat sebuah kotak, yang tiap tiap kotaknya memiliki angka dan pasti urutan angkanya dimulai dari angka 0</w:t>
-      </w:r>
-    </w:p>
-    <w:p>
-      <w:pPr>
-        <w:rPr>
-          <w:rFonts w:ascii="Arial Black" w:hAnsi="Arial Black"/>
-          <w:sz w:val="28"/>
-          <w:szCs w:val="28"/>
-        </w:rPr>
-      </w:pPr>
-    </w:p>
-    <w:p>
-      <w:pPr>
-        <w:rPr>
-          <w:rFonts w:ascii="Arial Black" w:hAnsi="Arial Black"/>
-          <w:sz w:val="28"/>
-          <w:szCs w:val="28"/>
-        </w:rPr>
-      </w:pPr>
-      <w:r>
-        <w:rPr>
-          <w:rFonts w:ascii="Arial Black" w:hAnsi="Arial Black"/>
-          <w:sz w:val="28"/>
-          <w:szCs w:val="28"/>
-        </w:rPr>
         <w:t>Elemen pada array boleh beda tipe</w:t>
       </w:r>
     </w:p>
@@ -16589,7 +16555,6 @@
           <w:sz w:val="28"/>
           <w:szCs w:val="28"/>
         </w:rPr>
-        <w:lastRenderedPageBreak/>
         <w:t xml:space="preserve">mengganti ke array yang baru / splice adalah menymbung / menambal   </w:t>
       </w:r>
     </w:p>
@@ -16708,6 +16673,7 @@
           <w:sz w:val="28"/>
           <w:szCs w:val="28"/>
         </w:rPr>
+        <w:lastRenderedPageBreak/>
         <w:t>Find ( find mencari 1 nilai, find juga tidak menghasilkan satu nilai )</w:t>
       </w:r>
     </w:p>
@@ -16860,76 +16826,76 @@
           <w:sz w:val="28"/>
           <w:szCs w:val="28"/>
         </w:rPr>
+        <w:t>Kenapa harus menggunakan object?</w:t>
+      </w:r>
+    </w:p>
+    <w:p>
+      <w:pPr>
+        <w:rPr>
+          <w:rFonts w:ascii="Arial Black" w:hAnsi="Arial Black"/>
+          <w:sz w:val="28"/>
+          <w:szCs w:val="28"/>
+        </w:rPr>
+      </w:pPr>
+      <w:r>
+        <w:rPr>
+          <w:rFonts w:ascii="Arial Black" w:hAnsi="Arial Black"/>
+          <w:sz w:val="28"/>
+          <w:szCs w:val="28"/>
+        </w:rPr>
+        <w:t>Kalo ada variable yang di dalam object disebut property</w:t>
+      </w:r>
+    </w:p>
+    <w:p>
+      <w:pPr>
+        <w:rPr>
+          <w:rFonts w:ascii="Arial Black" w:hAnsi="Arial Black"/>
+          <w:sz w:val="28"/>
+          <w:szCs w:val="28"/>
+        </w:rPr>
+      </w:pPr>
+    </w:p>
+    <w:p>
+      <w:pPr>
+        <w:rPr>
+          <w:rFonts w:ascii="Arial Black" w:hAnsi="Arial Black"/>
+          <w:sz w:val="28"/>
+          <w:szCs w:val="28"/>
+        </w:rPr>
+      </w:pPr>
+      <w:r>
+        <w:rPr>
+          <w:rFonts w:ascii="Arial Black" w:hAnsi="Arial Black"/>
+          <w:sz w:val="28"/>
+          <w:szCs w:val="28"/>
+        </w:rPr>
+        <w:t>Function yang didalam object disebut dengan menthod</w:t>
+      </w:r>
+    </w:p>
+    <w:p>
+      <w:pPr>
+        <w:rPr>
+          <w:rFonts w:ascii="Arial Black" w:hAnsi="Arial Black"/>
+          <w:sz w:val="28"/>
+          <w:szCs w:val="28"/>
+        </w:rPr>
+      </w:pPr>
+    </w:p>
+    <w:p>
+      <w:pPr>
+        <w:rPr>
+          <w:rFonts w:ascii="Arial Black" w:hAnsi="Arial Black"/>
+          <w:sz w:val="28"/>
+          <w:szCs w:val="28"/>
+        </w:rPr>
+      </w:pPr>
+      <w:r>
+        <w:rPr>
+          <w:rFonts w:ascii="Arial Black" w:hAnsi="Arial Black"/>
+          <w:sz w:val="28"/>
+          <w:szCs w:val="28"/>
+        </w:rPr>
         <w:lastRenderedPageBreak/>
-        <w:t>Kenapa harus menggunakan object?</w:t>
-      </w:r>
-    </w:p>
-    <w:p>
-      <w:pPr>
-        <w:rPr>
-          <w:rFonts w:ascii="Arial Black" w:hAnsi="Arial Black"/>
-          <w:sz w:val="28"/>
-          <w:szCs w:val="28"/>
-        </w:rPr>
-      </w:pPr>
-      <w:r>
-        <w:rPr>
-          <w:rFonts w:ascii="Arial Black" w:hAnsi="Arial Black"/>
-          <w:sz w:val="28"/>
-          <w:szCs w:val="28"/>
-        </w:rPr>
-        <w:t>Kalo ada variable yang di dalam object disebut property</w:t>
-      </w:r>
-    </w:p>
-    <w:p>
-      <w:pPr>
-        <w:rPr>
-          <w:rFonts w:ascii="Arial Black" w:hAnsi="Arial Black"/>
-          <w:sz w:val="28"/>
-          <w:szCs w:val="28"/>
-        </w:rPr>
-      </w:pPr>
-    </w:p>
-    <w:p>
-      <w:pPr>
-        <w:rPr>
-          <w:rFonts w:ascii="Arial Black" w:hAnsi="Arial Black"/>
-          <w:sz w:val="28"/>
-          <w:szCs w:val="28"/>
-        </w:rPr>
-      </w:pPr>
-      <w:r>
-        <w:rPr>
-          <w:rFonts w:ascii="Arial Black" w:hAnsi="Arial Black"/>
-          <w:sz w:val="28"/>
-          <w:szCs w:val="28"/>
-        </w:rPr>
-        <w:t>Function yang didalam object disebut dengan menthod</w:t>
-      </w:r>
-    </w:p>
-    <w:p>
-      <w:pPr>
-        <w:rPr>
-          <w:rFonts w:ascii="Arial Black" w:hAnsi="Arial Black"/>
-          <w:sz w:val="28"/>
-          <w:szCs w:val="28"/>
-        </w:rPr>
-      </w:pPr>
-    </w:p>
-    <w:p>
-      <w:pPr>
-        <w:rPr>
-          <w:rFonts w:ascii="Arial Black" w:hAnsi="Arial Black"/>
-          <w:sz w:val="28"/>
-          <w:szCs w:val="28"/>
-        </w:rPr>
-      </w:pPr>
-      <w:r>
-        <w:rPr>
-          <w:rFonts w:ascii="Arial Black" w:hAnsi="Arial Black"/>
-          <w:sz w:val="28"/>
-          <w:szCs w:val="28"/>
-        </w:rPr>
         <w:t>Isi dari object dan properti dan methodnya  kita bisa tulisa langsung lewat console</w:t>
       </w:r>
     </w:p>
@@ -17381,7 +17347,6 @@
           <w:sz w:val="28"/>
           <w:szCs w:val="28"/>
         </w:rPr>
-        <w:lastRenderedPageBreak/>
         <w:t>Tidak perlu bikin object baru</w:t>
       </w:r>
     </w:p>
@@ -17471,6 +17436,7 @@
           <w:sz w:val="28"/>
           <w:szCs w:val="28"/>
         </w:rPr>
+        <w:lastRenderedPageBreak/>
         <w:t>Execution context adalah saat program kalian dijalankan,</w:t>
       </w:r>
     </w:p>
@@ -17694,7 +17660,6 @@
           <w:sz w:val="28"/>
           <w:szCs w:val="28"/>
         </w:rPr>
-        <w:lastRenderedPageBreak/>
         <w:t>Tecshit  “closure adalah sebuah function yang sebelumnya sudah memiliki data, hasil dari function yang lain”</w:t>
       </w:r>
     </w:p>
@@ -17783,6 +17748,7 @@
           <w:sz w:val="28"/>
           <w:szCs w:val="28"/>
         </w:rPr>
+        <w:lastRenderedPageBreak/>
         <w:t>Let</w:t>
       </w:r>
     </w:p>
@@ -18022,8 +17988,215 @@
           <w:sz w:val="28"/>
           <w:szCs w:val="28"/>
         </w:rPr>
+        <w:t>Anonymus Function adalah function tidak bernama</w:t>
+      </w:r>
+      <w:proofErr w:type="gramStart"/>
+      <w:r>
+        <w:rPr>
+          <w:rFonts w:ascii="Arial Black" w:hAnsi="Arial Black"/>
+          <w:sz w:val="28"/>
+          <w:szCs w:val="28"/>
+        </w:rPr>
+        <w:t>,  caranya</w:t>
+      </w:r>
+      <w:proofErr w:type="gramEnd"/>
+      <w:r>
+        <w:rPr>
+          <w:rFonts w:ascii="Arial Black" w:hAnsi="Arial Black"/>
+          <w:sz w:val="28"/>
+          <w:szCs w:val="28"/>
+        </w:rPr>
+        <w:t xml:space="preserve"> dengan menggunakan function </w:t>
+      </w:r>
+      <w:r>
+        <w:rPr>
+          <w:rFonts w:ascii="Arial Black" w:hAnsi="Arial Black"/>
+          <w:sz w:val="28"/>
+          <w:szCs w:val="28"/>
+        </w:rPr>
+        <w:t>expression</w:t>
+      </w:r>
+    </w:p>
+    <w:p>
+      <w:pPr>
+        <w:rPr>
+          <w:rFonts w:ascii="Arial Black" w:hAnsi="Arial Black"/>
+          <w:sz w:val="28"/>
+          <w:szCs w:val="28"/>
+        </w:rPr>
+      </w:pPr>
+    </w:p>
+    <w:p>
+      <w:pPr>
+        <w:jc w:val="center"/>
+        <w:rPr>
+          <w:rFonts w:ascii="Arial Black" w:hAnsi="Arial Black"/>
+          <w:sz w:val="28"/>
+          <w:szCs w:val="28"/>
+        </w:rPr>
+      </w:pPr>
+    </w:p>
+    <w:p>
+      <w:pPr>
+        <w:jc w:val="center"/>
+        <w:rPr>
+          <w:rFonts w:ascii="Arial Black" w:hAnsi="Arial Black"/>
+          <w:sz w:val="28"/>
+          <w:szCs w:val="28"/>
+        </w:rPr>
+      </w:pPr>
+      <w:r>
+        <w:rPr>
+          <w:rFonts w:ascii="Arial Black" w:hAnsi="Arial Black"/>
+          <w:sz w:val="28"/>
+          <w:szCs w:val="28"/>
+        </w:rPr>
+        <w:t>ARROW FUNCTION</w:t>
+      </w:r>
+    </w:p>
+    <w:p>
+      <w:pPr>
+        <w:jc w:val="center"/>
+        <w:rPr>
+          <w:rFonts w:ascii="Arial Black" w:hAnsi="Arial Black"/>
+          <w:sz w:val="28"/>
+          <w:szCs w:val="28"/>
+        </w:rPr>
+      </w:pPr>
+      <w:r>
+        <w:rPr>
+          <w:rFonts w:ascii="Arial Black" w:hAnsi="Arial Black"/>
+          <w:sz w:val="28"/>
+          <w:szCs w:val="28"/>
+        </w:rPr>
+        <w:t>Bentuk lain yang lebih ringkas dari function exspresion</w:t>
+      </w:r>
+    </w:p>
+    <w:p>
+      <w:pPr>
+        <w:rPr>
+          <w:rFonts w:ascii="Arial Black" w:hAnsi="Arial Black"/>
+          <w:sz w:val="28"/>
+          <w:szCs w:val="28"/>
+        </w:rPr>
+      </w:pPr>
+    </w:p>
+    <w:p>
+      <w:pPr>
+        <w:jc w:val="center"/>
+        <w:rPr>
+          <w:rFonts w:ascii="Arial Black" w:hAnsi="Arial Black"/>
+          <w:sz w:val="28"/>
+          <w:szCs w:val="28"/>
+        </w:rPr>
+      </w:pPr>
+      <w:r>
+        <w:rPr>
+          <w:rFonts w:ascii="Arial Black" w:hAnsi="Arial Black"/>
+          <w:sz w:val="28"/>
+          <w:szCs w:val="28"/>
+        </w:rPr>
+        <w:t>HIRE ORDER FUNCTION</w:t>
+      </w:r>
+    </w:p>
+    <w:p>
+      <w:pPr>
+        <w:jc w:val="center"/>
+        <w:rPr>
+          <w:rFonts w:ascii="Arial Black" w:hAnsi="Arial Black"/>
+          <w:sz w:val="28"/>
+          <w:szCs w:val="28"/>
+        </w:rPr>
+      </w:pPr>
+      <w:r>
+        <w:rPr>
+          <w:rFonts w:ascii="Arial Black" w:hAnsi="Arial Black"/>
+          <w:sz w:val="28"/>
+          <w:szCs w:val="28"/>
+        </w:rPr>
         <w:lastRenderedPageBreak/>
-        <w:t>Anonymus Function adalah function tidak bernama</w:t>
+        <w:t>Function yang beroperasi pada function yang lain, baik di gunakan dalam argument, maupun sebagai return value</w:t>
+      </w:r>
+    </w:p>
+    <w:p>
+      <w:pPr>
+        <w:jc w:val="center"/>
+        <w:rPr>
+          <w:rFonts w:ascii="Arial Black" w:hAnsi="Arial Black"/>
+          <w:sz w:val="28"/>
+          <w:szCs w:val="28"/>
+        </w:rPr>
+      </w:pPr>
+      <w:r>
+        <w:rPr>
+          <w:rFonts w:ascii="Arial Black" w:hAnsi="Arial Black"/>
+          <w:sz w:val="28"/>
+          <w:szCs w:val="28"/>
+        </w:rPr>
+        <w:t xml:space="preserve">Karena di dalam java script sebuah function disebut frist class function artinya inti dari javascript itu adalah function </w:t>
+      </w:r>
+    </w:p>
+    <w:p>
+      <w:pPr>
+        <w:jc w:val="center"/>
+        <w:rPr>
+          <w:rFonts w:ascii="Arial Black" w:hAnsi="Arial Black"/>
+          <w:sz w:val="28"/>
+          <w:szCs w:val="28"/>
+        </w:rPr>
+      </w:pPr>
+      <w:r>
+        <w:rPr>
+          <w:rFonts w:ascii="Arial Black" w:hAnsi="Arial Black"/>
+          <w:sz w:val="28"/>
+          <w:szCs w:val="28"/>
+        </w:rPr>
+        <w:t>Dimana javascript memperlakukan function sebagai object</w:t>
+      </w:r>
+    </w:p>
+    <w:p>
+      <w:pPr>
+        <w:jc w:val="center"/>
+        <w:rPr>
+          <w:rFonts w:ascii="Arial Black" w:hAnsi="Arial Black"/>
+          <w:sz w:val="28"/>
+          <w:szCs w:val="28"/>
+        </w:rPr>
+      </w:pPr>
+      <w:r>
+        <w:rPr>
+          <w:rFonts w:ascii="Arial Black" w:hAnsi="Arial Black"/>
+          <w:sz w:val="28"/>
+          <w:szCs w:val="28"/>
+        </w:rPr>
+        <w:t xml:space="preserve">Function bisa disimpan di argument maupun return value dari sebuah function yang lain </w:t>
+      </w:r>
+    </w:p>
+    <w:p>
+      <w:pPr>
+        <w:jc w:val="center"/>
+        <w:rPr>
+          <w:rFonts w:ascii="Arial Black" w:hAnsi="Arial Black"/>
+          <w:sz w:val="28"/>
+          <w:szCs w:val="28"/>
+        </w:rPr>
+      </w:pPr>
+    </w:p>
+    <w:p>
+      <w:pPr>
+        <w:rPr>
+          <w:rFonts w:ascii="Arial Black" w:hAnsi="Arial Black"/>
+          <w:sz w:val="28"/>
+          <w:szCs w:val="28"/>
+        </w:rPr>
+      </w:pPr>
+      <w:r>
+        <w:rPr>
+          <w:rFonts w:ascii="Arial Black" w:hAnsi="Arial Black"/>
+          <w:sz w:val="28"/>
+          <w:szCs w:val="28"/>
+        </w:rPr>
+        <w:t xml:space="preserve">Kenapa harus menggunakan hire order </w:t>
       </w:r>
       <w:proofErr w:type="gramStart"/>
       <w:r>
@@ -18032,224 +18205,17 @@
           <w:sz w:val="28"/>
           <w:szCs w:val="28"/>
         </w:rPr>
-        <w:t>,  caranya</w:t>
+        <w:t>function</w:t>
+      </w:r>
+      <w:r>
+        <w:rPr>
+          <w:rFonts w:ascii="Arial Black" w:hAnsi="Arial Black"/>
+          <w:sz w:val="28"/>
+          <w:szCs w:val="28"/>
+        </w:rPr>
+        <w:t xml:space="preserve"> ?</w:t>
       </w:r>
       <w:proofErr w:type="gramEnd"/>
-      <w:r>
-        <w:rPr>
-          <w:rFonts w:ascii="Arial Black" w:hAnsi="Arial Black"/>
-          <w:sz w:val="28"/>
-          <w:szCs w:val="28"/>
-        </w:rPr>
-        <w:t xml:space="preserve"> dengan menggunakan function </w:t>
-      </w:r>
-      <w:r>
-        <w:rPr>
-          <w:rFonts w:ascii="Arial Black" w:hAnsi="Arial Black"/>
-          <w:sz w:val="28"/>
-          <w:szCs w:val="28"/>
-        </w:rPr>
-        <w:t>expression</w:t>
-      </w:r>
-    </w:p>
-    <w:p>
-      <w:pPr>
-        <w:rPr>
-          <w:rFonts w:ascii="Arial Black" w:hAnsi="Arial Black"/>
-          <w:sz w:val="28"/>
-          <w:szCs w:val="28"/>
-        </w:rPr>
-      </w:pPr>
-    </w:p>
-    <w:p>
-      <w:pPr>
-        <w:jc w:val="center"/>
-        <w:rPr>
-          <w:rFonts w:ascii="Arial Black" w:hAnsi="Arial Black"/>
-          <w:sz w:val="28"/>
-          <w:szCs w:val="28"/>
-        </w:rPr>
-      </w:pPr>
-    </w:p>
-    <w:p>
-      <w:pPr>
-        <w:jc w:val="center"/>
-        <w:rPr>
-          <w:rFonts w:ascii="Arial Black" w:hAnsi="Arial Black"/>
-          <w:sz w:val="28"/>
-          <w:szCs w:val="28"/>
-        </w:rPr>
-      </w:pPr>
-      <w:r>
-        <w:rPr>
-          <w:rFonts w:ascii="Arial Black" w:hAnsi="Arial Black"/>
-          <w:sz w:val="28"/>
-          <w:szCs w:val="28"/>
-        </w:rPr>
-        <w:t>ARROW FUNCTION</w:t>
-      </w:r>
-    </w:p>
-    <w:p>
-      <w:pPr>
-        <w:jc w:val="center"/>
-        <w:rPr>
-          <w:rFonts w:ascii="Arial Black" w:hAnsi="Arial Black"/>
-          <w:sz w:val="28"/>
-          <w:szCs w:val="28"/>
-        </w:rPr>
-      </w:pPr>
-      <w:r>
-        <w:rPr>
-          <w:rFonts w:ascii="Arial Black" w:hAnsi="Arial Black"/>
-          <w:sz w:val="28"/>
-          <w:szCs w:val="28"/>
-        </w:rPr>
-        <w:t>Bentuk lain yang lebih ringkas dari function exspresion</w:t>
-      </w:r>
-    </w:p>
-    <w:p>
-      <w:pPr>
-        <w:rPr>
-          <w:rFonts w:ascii="Arial Black" w:hAnsi="Arial Black"/>
-          <w:sz w:val="28"/>
-          <w:szCs w:val="28"/>
-        </w:rPr>
-      </w:pPr>
-    </w:p>
-    <w:p>
-      <w:pPr>
-        <w:jc w:val="center"/>
-        <w:rPr>
-          <w:rFonts w:ascii="Arial Black" w:hAnsi="Arial Black"/>
-          <w:sz w:val="28"/>
-          <w:szCs w:val="28"/>
-        </w:rPr>
-      </w:pPr>
-      <w:r>
-        <w:rPr>
-          <w:rFonts w:ascii="Arial Black" w:hAnsi="Arial Black"/>
-          <w:sz w:val="28"/>
-          <w:szCs w:val="28"/>
-        </w:rPr>
-        <w:t>HIRE ORDER FUNCTION</w:t>
-      </w:r>
-    </w:p>
-    <w:p>
-      <w:pPr>
-        <w:jc w:val="center"/>
-        <w:rPr>
-          <w:rFonts w:ascii="Arial Black" w:hAnsi="Arial Black"/>
-          <w:sz w:val="28"/>
-          <w:szCs w:val="28"/>
-        </w:rPr>
-      </w:pPr>
-      <w:r>
-        <w:rPr>
-          <w:rFonts w:ascii="Arial Black" w:hAnsi="Arial Black"/>
-          <w:sz w:val="28"/>
-          <w:szCs w:val="28"/>
-        </w:rPr>
-        <w:t>Function yang beroperasi pada function yang lain, baik di gunakan dalam argument, maupun sebagai return value</w:t>
-      </w:r>
-    </w:p>
-    <w:p>
-      <w:pPr>
-        <w:jc w:val="center"/>
-        <w:rPr>
-          <w:rFonts w:ascii="Arial Black" w:hAnsi="Arial Black"/>
-          <w:sz w:val="28"/>
-          <w:szCs w:val="28"/>
-        </w:rPr>
-      </w:pPr>
-      <w:r>
-        <w:rPr>
-          <w:rFonts w:ascii="Arial Black" w:hAnsi="Arial Black"/>
-          <w:sz w:val="28"/>
-          <w:szCs w:val="28"/>
-        </w:rPr>
-        <w:t xml:space="preserve">Karena di dalam java script sebuah function disebut frist class function artinya inti dari javascript itu adalah function </w:t>
-      </w:r>
-    </w:p>
-    <w:p>
-      <w:pPr>
-        <w:jc w:val="center"/>
-        <w:rPr>
-          <w:rFonts w:ascii="Arial Black" w:hAnsi="Arial Black"/>
-          <w:sz w:val="28"/>
-          <w:szCs w:val="28"/>
-        </w:rPr>
-      </w:pPr>
-      <w:r>
-        <w:rPr>
-          <w:rFonts w:ascii="Arial Black" w:hAnsi="Arial Black"/>
-          <w:sz w:val="28"/>
-          <w:szCs w:val="28"/>
-        </w:rPr>
-        <w:t>Dimana javascript memperlakukan function sebagai object</w:t>
-      </w:r>
-    </w:p>
-    <w:p>
-      <w:pPr>
-        <w:jc w:val="center"/>
-        <w:rPr>
-          <w:rFonts w:ascii="Arial Black" w:hAnsi="Arial Black"/>
-          <w:sz w:val="28"/>
-          <w:szCs w:val="28"/>
-        </w:rPr>
-      </w:pPr>
-      <w:r>
-        <w:rPr>
-          <w:rFonts w:ascii="Arial Black" w:hAnsi="Arial Black"/>
-          <w:sz w:val="28"/>
-          <w:szCs w:val="28"/>
-        </w:rPr>
-        <w:t xml:space="preserve">Function bisa disimpan di argument maupun return value dari sebuah function yang lain </w:t>
-      </w:r>
-    </w:p>
-    <w:p>
-      <w:pPr>
-        <w:jc w:val="center"/>
-        <w:rPr>
-          <w:rFonts w:ascii="Arial Black" w:hAnsi="Arial Black"/>
-          <w:sz w:val="28"/>
-          <w:szCs w:val="28"/>
-        </w:rPr>
-      </w:pPr>
-    </w:p>
-    <w:p>
-      <w:pPr>
-        <w:rPr>
-          <w:rFonts w:ascii="Arial Black" w:hAnsi="Arial Black"/>
-          <w:sz w:val="28"/>
-          <w:szCs w:val="28"/>
-        </w:rPr>
-      </w:pPr>
-      <w:r>
-        <w:rPr>
-          <w:rFonts w:ascii="Arial Black" w:hAnsi="Arial Black"/>
-          <w:sz w:val="28"/>
-          <w:szCs w:val="28"/>
-        </w:rPr>
-        <w:t xml:space="preserve">Kenapa harus menggunakan hire order </w:t>
-      </w:r>
-      <w:proofErr w:type="gramStart"/>
-      <w:r>
-        <w:rPr>
-          <w:rFonts w:ascii="Arial Black" w:hAnsi="Arial Black"/>
-          <w:sz w:val="28"/>
-          <w:szCs w:val="28"/>
-        </w:rPr>
-        <w:t>function</w:t>
-      </w:r>
-      <w:r>
-        <w:rPr>
-          <w:rFonts w:ascii="Arial Black" w:hAnsi="Arial Black"/>
-          <w:sz w:val="28"/>
-          <w:szCs w:val="28"/>
-        </w:rPr>
-        <w:t xml:space="preserve"> ?</w:t>
-      </w:r>
-      <w:proofErr w:type="gramEnd"/>
     </w:p>
     <w:p>
       <w:pPr>
@@ -18301,7 +18267,6 @@
           <w:sz w:val="28"/>
           <w:szCs w:val="28"/>
         </w:rPr>
-        <w:lastRenderedPageBreak/>
         <w:t>“</w:t>
       </w:r>
       <w:proofErr w:type="gramStart"/>
@@ -18418,6 +18383,7 @@
           <w:sz w:val="28"/>
           <w:szCs w:val="28"/>
         </w:rPr>
+        <w:lastRenderedPageBreak/>
         <w:t>Array.prototype.filter()</w:t>
       </w:r>
     </w:p>
@@ -18442,6 +18408,478 @@
         </w:rPr>
         <w:t>Array.prototype.reduce()</w:t>
       </w:r>
+    </w:p>
+    <w:p>
+      <w:pPr>
+        <w:rPr>
+          <w:rFonts w:ascii="Arial Black" w:hAnsi="Arial Black"/>
+          <w:sz w:val="28"/>
+          <w:szCs w:val="28"/>
+        </w:rPr>
+      </w:pPr>
+    </w:p>
+    <w:p>
+      <w:pPr>
+        <w:rPr>
+          <w:rFonts w:ascii="Arial Black" w:hAnsi="Arial Black"/>
+          <w:sz w:val="28"/>
+          <w:szCs w:val="28"/>
+        </w:rPr>
+      </w:pPr>
+    </w:p>
+    <w:p>
+      <w:pPr>
+        <w:jc w:val="center"/>
+        <w:rPr>
+          <w:rFonts w:ascii="Arial Black" w:hAnsi="Arial Black"/>
+          <w:sz w:val="40"/>
+          <w:szCs w:val="40"/>
+        </w:rPr>
+      </w:pPr>
+      <w:r>
+        <w:rPr>
+          <w:rFonts w:ascii="Arial Black" w:hAnsi="Arial Black"/>
+          <w:sz w:val="40"/>
+          <w:szCs w:val="40"/>
+        </w:rPr>
+        <w:t>FOR</w:t>
+      </w:r>
+      <w:proofErr w:type="gramStart"/>
+      <w:r>
+        <w:rPr>
+          <w:rFonts w:ascii="Arial Black" w:hAnsi="Arial Black"/>
+          <w:sz w:val="40"/>
+          <w:szCs w:val="40"/>
+        </w:rPr>
+        <w:t>..</w:t>
+      </w:r>
+      <w:proofErr w:type="gramEnd"/>
+      <w:r>
+        <w:rPr>
+          <w:rFonts w:ascii="Arial Black" w:hAnsi="Arial Black"/>
+          <w:sz w:val="40"/>
+          <w:szCs w:val="40"/>
+        </w:rPr>
+        <w:t xml:space="preserve"> OF &amp; FOR</w:t>
+      </w:r>
+      <w:proofErr w:type="gramStart"/>
+      <w:r>
+        <w:rPr>
+          <w:rFonts w:ascii="Arial Black" w:hAnsi="Arial Black"/>
+          <w:sz w:val="40"/>
+          <w:szCs w:val="40"/>
+        </w:rPr>
+        <w:t>..</w:t>
+      </w:r>
+      <w:proofErr w:type="gramEnd"/>
+      <w:r>
+        <w:rPr>
+          <w:rFonts w:ascii="Arial Black" w:hAnsi="Arial Black"/>
+          <w:sz w:val="40"/>
+          <w:szCs w:val="40"/>
+        </w:rPr>
+        <w:t xml:space="preserve"> IN</w:t>
+      </w:r>
+    </w:p>
+    <w:p>
+      <w:pPr>
+        <w:jc w:val="center"/>
+        <w:rPr>
+          <w:rFonts w:ascii="Arial Black" w:hAnsi="Arial Black"/>
+          <w:sz w:val="32"/>
+          <w:szCs w:val="32"/>
+        </w:rPr>
+      </w:pPr>
+      <w:r>
+        <w:rPr>
+          <w:rFonts w:ascii="Arial Black" w:hAnsi="Arial Black"/>
+          <w:sz w:val="32"/>
+          <w:szCs w:val="32"/>
+        </w:rPr>
+        <w:t>Looping baru pada</w:t>
+      </w:r>
+      <w:r>
+        <w:rPr>
+          <w:rFonts w:ascii="Arial Black" w:hAnsi="Arial Black"/>
+          <w:sz w:val="32"/>
+          <w:szCs w:val="32"/>
+        </w:rPr>
+        <w:t xml:space="preserve"> javascript</w:t>
+      </w:r>
+    </w:p>
+    <w:p>
+      <w:pPr>
+        <w:rPr>
+          <w:rFonts w:ascii="Arial Black" w:hAnsi="Arial Black"/>
+          <w:sz w:val="32"/>
+          <w:szCs w:val="32"/>
+        </w:rPr>
+      </w:pPr>
+    </w:p>
+    <w:p>
+      <w:pPr>
+        <w:rPr>
+          <w:rFonts w:ascii="Arial Black" w:hAnsi="Arial Black"/>
+          <w:sz w:val="32"/>
+          <w:szCs w:val="32"/>
+        </w:rPr>
+      </w:pPr>
+      <w:r>
+        <w:rPr>
+          <w:rFonts w:ascii="Arial Black" w:hAnsi="Arial Black"/>
+          <w:sz w:val="32"/>
+          <w:szCs w:val="32"/>
+        </w:rPr>
+        <w:t>For Of</w:t>
+      </w:r>
+    </w:p>
+    <w:p>
+      <w:pPr>
+        <w:rPr>
+          <w:rFonts w:ascii="Arial Black" w:hAnsi="Arial Black"/>
+          <w:sz w:val="32"/>
+          <w:szCs w:val="32"/>
+        </w:rPr>
+      </w:pPr>
+      <w:proofErr w:type="gramStart"/>
+      <w:r>
+        <w:rPr>
+          <w:rFonts w:ascii="Arial Black" w:hAnsi="Arial Black"/>
+          <w:sz w:val="32"/>
+          <w:szCs w:val="32"/>
+        </w:rPr>
+        <w:t>“ creates</w:t>
+      </w:r>
+      <w:proofErr w:type="gramEnd"/>
+      <w:r>
+        <w:rPr>
+          <w:rFonts w:ascii="Arial Black" w:hAnsi="Arial Black"/>
+          <w:sz w:val="32"/>
+          <w:szCs w:val="32"/>
+        </w:rPr>
+        <w:t xml:space="preserve"> a loop iterating over iterable object / sebuah looping yang bisa menelusuri object” yang iterable  “</w:t>
+      </w:r>
+    </w:p>
+    <w:p>
+      <w:pPr>
+        <w:rPr>
+          <w:rFonts w:ascii="Arial Black" w:hAnsi="Arial Black"/>
+          <w:sz w:val="32"/>
+          <w:szCs w:val="32"/>
+        </w:rPr>
+      </w:pPr>
+      <w:r>
+        <w:rPr>
+          <w:rFonts w:ascii="Arial Black" w:hAnsi="Arial Black"/>
+          <w:sz w:val="32"/>
+          <w:szCs w:val="32"/>
+        </w:rPr>
+        <w:t xml:space="preserve">Literable </w:t>
+      </w:r>
+      <w:proofErr w:type="gramStart"/>
+      <w:r>
+        <w:rPr>
+          <w:rFonts w:ascii="Arial Black" w:hAnsi="Arial Black"/>
+          <w:sz w:val="32"/>
+          <w:szCs w:val="32"/>
+        </w:rPr>
+        <w:t>object :</w:t>
+      </w:r>
+      <w:proofErr w:type="gramEnd"/>
+    </w:p>
+    <w:p>
+      <w:pPr>
+        <w:pStyle w:val="ListParagraph"/>
+        <w:numPr>
+          <w:ilvl w:val="0"/>
+          <w:numId w:val="43"/>
+        </w:numPr>
+        <w:rPr>
+          <w:rFonts w:ascii="Arial Black" w:hAnsi="Arial Black"/>
+          <w:sz w:val="32"/>
+          <w:szCs w:val="32"/>
+        </w:rPr>
+      </w:pPr>
+      <w:r>
+        <w:rPr>
+          <w:rFonts w:ascii="Arial Black" w:hAnsi="Arial Black"/>
+          <w:sz w:val="32"/>
+          <w:szCs w:val="32"/>
+        </w:rPr>
+        <w:t>String</w:t>
+      </w:r>
+    </w:p>
+    <w:p>
+      <w:pPr>
+        <w:pStyle w:val="ListParagraph"/>
+        <w:numPr>
+          <w:ilvl w:val="0"/>
+          <w:numId w:val="43"/>
+        </w:numPr>
+        <w:rPr>
+          <w:rFonts w:ascii="Arial Black" w:hAnsi="Arial Black"/>
+          <w:sz w:val="32"/>
+          <w:szCs w:val="32"/>
+        </w:rPr>
+      </w:pPr>
+      <w:r>
+        <w:rPr>
+          <w:rFonts w:ascii="Arial Black" w:hAnsi="Arial Black"/>
+          <w:sz w:val="32"/>
+          <w:szCs w:val="32"/>
+        </w:rPr>
+        <w:t>Array</w:t>
+      </w:r>
+    </w:p>
+    <w:p>
+      <w:pPr>
+        <w:pStyle w:val="ListParagraph"/>
+        <w:numPr>
+          <w:ilvl w:val="0"/>
+          <w:numId w:val="43"/>
+        </w:numPr>
+        <w:rPr>
+          <w:rFonts w:ascii="Arial Black" w:hAnsi="Arial Black"/>
+          <w:sz w:val="32"/>
+          <w:szCs w:val="32"/>
+        </w:rPr>
+      </w:pPr>
+      <w:r>
+        <w:rPr>
+          <w:rFonts w:ascii="Arial Black" w:hAnsi="Arial Black"/>
+          <w:sz w:val="32"/>
+          <w:szCs w:val="32"/>
+        </w:rPr>
+        <w:t>Arguments / nodelist ( node list ketika kita melakukan query pada dom )</w:t>
+      </w:r>
+    </w:p>
+    <w:p>
+      <w:pPr>
+        <w:pStyle w:val="ListParagraph"/>
+        <w:numPr>
+          <w:ilvl w:val="0"/>
+          <w:numId w:val="43"/>
+        </w:numPr>
+        <w:rPr>
+          <w:rFonts w:ascii="Arial Black" w:hAnsi="Arial Black"/>
+          <w:sz w:val="32"/>
+          <w:szCs w:val="32"/>
+        </w:rPr>
+      </w:pPr>
+      <w:r>
+        <w:rPr>
+          <w:rFonts w:ascii="Arial Black" w:hAnsi="Arial Black"/>
+          <w:sz w:val="32"/>
+          <w:szCs w:val="32"/>
+        </w:rPr>
+        <w:t>Typedarray</w:t>
+      </w:r>
+    </w:p>
+    <w:p>
+      <w:pPr>
+        <w:pStyle w:val="ListParagraph"/>
+        <w:numPr>
+          <w:ilvl w:val="0"/>
+          <w:numId w:val="43"/>
+        </w:numPr>
+        <w:rPr>
+          <w:rFonts w:ascii="Arial Black" w:hAnsi="Arial Black"/>
+          <w:sz w:val="32"/>
+          <w:szCs w:val="32"/>
+        </w:rPr>
+      </w:pPr>
+      <w:r>
+        <w:rPr>
+          <w:rFonts w:ascii="Arial Black" w:hAnsi="Arial Black"/>
+          <w:sz w:val="32"/>
+          <w:szCs w:val="32"/>
+        </w:rPr>
+        <w:t>Map</w:t>
+      </w:r>
+    </w:p>
+    <w:p>
+      <w:pPr>
+        <w:pStyle w:val="ListParagraph"/>
+        <w:numPr>
+          <w:ilvl w:val="0"/>
+          <w:numId w:val="43"/>
+        </w:numPr>
+        <w:rPr>
+          <w:rFonts w:ascii="Arial Black" w:hAnsi="Arial Black"/>
+          <w:sz w:val="32"/>
+          <w:szCs w:val="32"/>
+        </w:rPr>
+      </w:pPr>
+      <w:r>
+        <w:rPr>
+          <w:rFonts w:ascii="Arial Black" w:hAnsi="Arial Black"/>
+          <w:sz w:val="32"/>
+          <w:szCs w:val="32"/>
+        </w:rPr>
+        <w:t>Set</w:t>
+      </w:r>
+    </w:p>
+    <w:p>
+      <w:pPr>
+        <w:pStyle w:val="ListParagraph"/>
+        <w:numPr>
+          <w:ilvl w:val="0"/>
+          <w:numId w:val="43"/>
+        </w:numPr>
+        <w:rPr>
+          <w:rFonts w:ascii="Arial Black" w:hAnsi="Arial Black"/>
+          <w:sz w:val="32"/>
+          <w:szCs w:val="32"/>
+        </w:rPr>
+      </w:pPr>
+      <w:r>
+        <w:rPr>
+          <w:rFonts w:ascii="Arial Black" w:hAnsi="Arial Black"/>
+          <w:sz w:val="32"/>
+          <w:szCs w:val="32"/>
+        </w:rPr>
+        <w:t>User-defined iterables</w:t>
+      </w:r>
+    </w:p>
+    <w:p>
+      <w:pPr>
+        <w:rPr>
+          <w:rFonts w:ascii="Arial Black" w:hAnsi="Arial Black"/>
+          <w:sz w:val="32"/>
+          <w:szCs w:val="32"/>
+        </w:rPr>
+      </w:pPr>
+    </w:p>
+    <w:p>
+      <w:pPr>
+        <w:jc w:val="center"/>
+        <w:rPr>
+          <w:rFonts w:ascii="Arial Black" w:hAnsi="Arial Black"/>
+          <w:sz w:val="44"/>
+          <w:szCs w:val="44"/>
+        </w:rPr>
+      </w:pPr>
+      <w:r>
+        <w:rPr>
+          <w:rFonts w:ascii="Arial Black" w:hAnsi="Arial Black"/>
+          <w:sz w:val="44"/>
+          <w:szCs w:val="44"/>
+        </w:rPr>
+        <w:lastRenderedPageBreak/>
+        <w:t>SPREAD OPERATOR</w:t>
+      </w:r>
+    </w:p>
+    <w:p>
+      <w:pPr>
+        <w:jc w:val="center"/>
+        <w:rPr>
+          <w:rFonts w:ascii="Arial Black" w:hAnsi="Arial Black"/>
+          <w:sz w:val="32"/>
+          <w:szCs w:val="32"/>
+        </w:rPr>
+      </w:pPr>
+      <w:r>
+        <w:rPr>
+          <w:rFonts w:ascii="Arial Black" w:hAnsi="Arial Black"/>
+          <w:sz w:val="44"/>
+          <w:szCs w:val="44"/>
+        </w:rPr>
+        <w:t>“</w:t>
+      </w:r>
+      <w:r>
+        <w:rPr>
+          <w:rFonts w:ascii="Arial Black" w:hAnsi="Arial Black"/>
+          <w:sz w:val="32"/>
+          <w:szCs w:val="32"/>
+        </w:rPr>
+        <w:t xml:space="preserve"> mecah (expand / unpack) iterables menjadi single element “</w:t>
+      </w:r>
+      <w:bookmarkStart w:id="0" w:name="_GoBack"/>
+      <w:bookmarkEnd w:id="0"/>
+    </w:p>
+    <w:p>
+      <w:pPr>
+        <w:rPr>
+          <w:rFonts w:ascii="Arial Black" w:hAnsi="Arial Black"/>
+          <w:sz w:val="32"/>
+          <w:szCs w:val="32"/>
+        </w:rPr>
+      </w:pPr>
+    </w:p>
+    <w:p>
+      <w:pPr>
+        <w:rPr>
+          <w:rFonts w:ascii="Arial Black" w:hAnsi="Arial Black"/>
+          <w:sz w:val="32"/>
+          <w:szCs w:val="32"/>
+        </w:rPr>
+      </w:pPr>
+      <w:r>
+        <w:rPr>
+          <w:rFonts w:ascii="Arial Black" w:hAnsi="Arial Black"/>
+          <w:sz w:val="32"/>
+          <w:szCs w:val="32"/>
+        </w:rPr>
+        <w:t>For In</w:t>
+      </w:r>
+    </w:p>
+    <w:p>
+      <w:pPr>
+        <w:rPr>
+          <w:rFonts w:ascii="Arial Black" w:hAnsi="Arial Black"/>
+          <w:sz w:val="32"/>
+          <w:szCs w:val="32"/>
+        </w:rPr>
+      </w:pPr>
+      <w:proofErr w:type="gramStart"/>
+      <w:r>
+        <w:rPr>
+          <w:rFonts w:ascii="Arial Black" w:hAnsi="Arial Black"/>
+          <w:sz w:val="32"/>
+          <w:szCs w:val="32"/>
+        </w:rPr>
+        <w:t>“ creates</w:t>
+      </w:r>
+      <w:proofErr w:type="gramEnd"/>
+      <w:r>
+        <w:rPr>
+          <w:rFonts w:ascii="Arial Black" w:hAnsi="Arial Black"/>
+          <w:sz w:val="32"/>
+          <w:szCs w:val="32"/>
+        </w:rPr>
+        <w:t xml:space="preserve"> a loop only iterating over enumerable / sebuah looping yang hanya menelusuri property pada object  “</w:t>
+      </w:r>
+    </w:p>
+    <w:p>
+      <w:pPr>
+        <w:pStyle w:val="ListParagraph"/>
+        <w:rPr>
+          <w:rFonts w:ascii="Arial Black" w:hAnsi="Arial Black"/>
+          <w:sz w:val="32"/>
+          <w:szCs w:val="32"/>
+        </w:rPr>
+      </w:pPr>
+    </w:p>
+    <w:p>
+      <w:pPr>
+        <w:ind w:left="2520" w:firstLine="360"/>
+        <w:jc w:val="center"/>
+        <w:rPr>
+          <w:rFonts w:ascii="Arial Black" w:hAnsi="Arial Black"/>
+          <w:sz w:val="28"/>
+          <w:szCs w:val="28"/>
+        </w:rPr>
+      </w:pPr>
+    </w:p>
+    <w:p>
+      <w:pPr>
+        <w:jc w:val="center"/>
+        <w:rPr>
+          <w:rFonts w:ascii="Arial Black" w:hAnsi="Arial Black"/>
+          <w:sz w:val="28"/>
+          <w:szCs w:val="28"/>
+        </w:rPr>
+      </w:pPr>
     </w:p>
     <w:p>
       <w:pPr>
@@ -22936,6 +23374,119 @@
     </w:lvl>
   </w:abstractNum>
   <w:abstractNum w:abstractNumId="36">
+    <w:nsid w:val="736253E4"/>
+    <w:multiLevelType w:val="hybridMultilevel"/>
+    <w:tmpl w:val="10A050DA"/>
+    <w:lvl w:ilvl="0" w:tplc="04090001">
+      <w:start w:val="1"/>
+      <w:numFmt w:val="bullet"/>
+      <w:lvlText w:val=""/>
+      <w:lvlJc w:val="left"/>
+      <w:pPr>
+        <w:ind w:left="720" w:hanging="360"/>
+      </w:pPr>
+      <w:rPr>
+        <w:rFonts w:ascii="Symbol" w:hAnsi="Symbol" w:hint="default"/>
+      </w:rPr>
+    </w:lvl>
+    <w:lvl w:ilvl="1" w:tplc="04090003" w:tentative="1">
+      <w:start w:val="1"/>
+      <w:numFmt w:val="bullet"/>
+      <w:lvlText w:val="o"/>
+      <w:lvlJc w:val="left"/>
+      <w:pPr>
+        <w:ind w:left="1440" w:hanging="360"/>
+      </w:pPr>
+      <w:rPr>
+        <w:rFonts w:ascii="Courier New" w:hAnsi="Courier New" w:cs="Courier New" w:hint="default"/>
+      </w:rPr>
+    </w:lvl>
+    <w:lvl w:ilvl="2" w:tplc="04090005" w:tentative="1">
+      <w:start w:val="1"/>
+      <w:numFmt w:val="bullet"/>
+      <w:lvlText w:val=""/>
+      <w:lvlJc w:val="left"/>
+      <w:pPr>
+        <w:ind w:left="2160" w:hanging="360"/>
+      </w:pPr>
+      <w:rPr>
+        <w:rFonts w:ascii="Wingdings" w:hAnsi="Wingdings" w:hint="default"/>
+      </w:rPr>
+    </w:lvl>
+    <w:lvl w:ilvl="3" w:tplc="04090001" w:tentative="1">
+      <w:start w:val="1"/>
+      <w:numFmt w:val="bullet"/>
+      <w:lvlText w:val=""/>
+      <w:lvlJc w:val="left"/>
+      <w:pPr>
+        <w:ind w:left="2880" w:hanging="360"/>
+      </w:pPr>
+      <w:rPr>
+        <w:rFonts w:ascii="Symbol" w:hAnsi="Symbol" w:hint="default"/>
+      </w:rPr>
+    </w:lvl>
+    <w:lvl w:ilvl="4" w:tplc="04090003" w:tentative="1">
+      <w:start w:val="1"/>
+      <w:numFmt w:val="bullet"/>
+      <w:lvlText w:val="o"/>
+      <w:lvlJc w:val="left"/>
+      <w:pPr>
+        <w:ind w:left="3600" w:hanging="360"/>
+      </w:pPr>
+      <w:rPr>
+        <w:rFonts w:ascii="Courier New" w:hAnsi="Courier New" w:cs="Courier New" w:hint="default"/>
+      </w:rPr>
+    </w:lvl>
+    <w:lvl w:ilvl="5" w:tplc="04090005" w:tentative="1">
+      <w:start w:val="1"/>
+      <w:numFmt w:val="bullet"/>
+      <w:lvlText w:val=""/>
+      <w:lvlJc w:val="left"/>
+      <w:pPr>
+        <w:ind w:left="4320" w:hanging="360"/>
+      </w:pPr>
+      <w:rPr>
+        <w:rFonts w:ascii="Wingdings" w:hAnsi="Wingdings" w:hint="default"/>
+      </w:rPr>
+    </w:lvl>
+    <w:lvl w:ilvl="6" w:tplc="04090001" w:tentative="1">
+      <w:start w:val="1"/>
+      <w:numFmt w:val="bullet"/>
+      <w:lvlText w:val=""/>
+      <w:lvlJc w:val="left"/>
+      <w:pPr>
+        <w:ind w:left="5040" w:hanging="360"/>
+      </w:pPr>
+      <w:rPr>
+        <w:rFonts w:ascii="Symbol" w:hAnsi="Symbol" w:hint="default"/>
+      </w:rPr>
+    </w:lvl>
+    <w:lvl w:ilvl="7" w:tplc="04090003" w:tentative="1">
+      <w:start w:val="1"/>
+      <w:numFmt w:val="bullet"/>
+      <w:lvlText w:val="o"/>
+      <w:lvlJc w:val="left"/>
+      <w:pPr>
+        <w:ind w:left="5760" w:hanging="360"/>
+      </w:pPr>
+      <w:rPr>
+        <w:rFonts w:ascii="Courier New" w:hAnsi="Courier New" w:cs="Courier New" w:hint="default"/>
+      </w:rPr>
+    </w:lvl>
+    <w:lvl w:ilvl="8" w:tplc="04090005" w:tentative="1">
+      <w:start w:val="1"/>
+      <w:numFmt w:val="bullet"/>
+      <w:lvlText w:val=""/>
+      <w:lvlJc w:val="left"/>
+      <w:pPr>
+        <w:ind w:left="6480" w:hanging="360"/>
+      </w:pPr>
+      <w:rPr>
+        <w:rFonts w:ascii="Wingdings" w:hAnsi="Wingdings" w:hint="default"/>
+      </w:rPr>
+    </w:lvl>
+  </w:abstractNum>
+  <w:abstractNum w:abstractNumId="37">
     <w:nsid w:val="759B7EAF"/>
     <w:multiLevelType w:val="hybridMultilevel"/>
     <w:tmpl w:val="FA88BAF0"/>
@@ -23048,7 +23599,7 @@
       </w:rPr>
     </w:lvl>
   </w:abstractNum>
-  <w:abstractNum w:abstractNumId="37">
+  <w:abstractNum w:abstractNumId="38">
     <w:nsid w:val="779149D6"/>
     <w:multiLevelType w:val="hybridMultilevel"/>
     <w:tmpl w:val="D8E2E62E"/>
@@ -23161,7 +23712,7 @@
       </w:rPr>
     </w:lvl>
   </w:abstractNum>
-  <w:abstractNum w:abstractNumId="38">
+  <w:abstractNum w:abstractNumId="39">
     <w:nsid w:val="791452A9"/>
     <w:multiLevelType w:val="hybridMultilevel"/>
     <w:tmpl w:val="C9EABB70"/>
@@ -23274,7 +23825,7 @@
       </w:rPr>
     </w:lvl>
   </w:abstractNum>
-  <w:abstractNum w:abstractNumId="39">
+  <w:abstractNum w:abstractNumId="40">
     <w:nsid w:val="7B1E7F01"/>
     <w:multiLevelType w:val="hybridMultilevel"/>
     <w:tmpl w:val="31CE3288"/>
@@ -23363,7 +23914,7 @@
       </w:pPr>
     </w:lvl>
   </w:abstractNum>
-  <w:abstractNum w:abstractNumId="40">
+  <w:abstractNum w:abstractNumId="41">
     <w:nsid w:val="7BA52B12"/>
     <w:multiLevelType w:val="hybridMultilevel"/>
     <w:tmpl w:val="32704F00"/>
@@ -23476,7 +24027,7 @@
       </w:rPr>
     </w:lvl>
   </w:abstractNum>
-  <w:abstractNum w:abstractNumId="41">
+  <w:abstractNum w:abstractNumId="42">
     <w:nsid w:val="7E985EAE"/>
     <w:multiLevelType w:val="hybridMultilevel"/>
     <w:tmpl w:val="E2FC67EE"/>
@@ -23616,7 +24167,7 @@
     <w:abstractNumId w:val="31"/>
   </w:num>
   <w:num w:numId="10">
-    <w:abstractNumId w:val="37"/>
+    <w:abstractNumId w:val="38"/>
   </w:num>
   <w:num w:numId="11">
     <w:abstractNumId w:val="0"/>
@@ -23625,7 +24176,7 @@
     <w:abstractNumId w:val="33"/>
   </w:num>
   <w:num w:numId="13">
-    <w:abstractNumId w:val="40"/>
+    <w:abstractNumId w:val="41"/>
   </w:num>
   <w:num w:numId="14">
     <w:abstractNumId w:val="16"/>
@@ -23658,7 +24209,7 @@
     <w:abstractNumId w:val="35"/>
   </w:num>
   <w:num w:numId="24">
-    <w:abstractNumId w:val="39"/>
+    <w:abstractNumId w:val="40"/>
   </w:num>
   <w:num w:numId="25">
     <w:abstractNumId w:val="29"/>
@@ -23673,7 +24224,7 @@
     <w:abstractNumId w:val="17"/>
   </w:num>
   <w:num w:numId="29">
-    <w:abstractNumId w:val="41"/>
+    <w:abstractNumId w:val="42"/>
   </w:num>
   <w:num w:numId="30">
     <w:abstractNumId w:val="12"/>
@@ -23682,7 +24233,7 @@
     <w:abstractNumId w:val="14"/>
   </w:num>
   <w:num w:numId="32">
-    <w:abstractNumId w:val="36"/>
+    <w:abstractNumId w:val="37"/>
   </w:num>
   <w:num w:numId="33">
     <w:abstractNumId w:val="5"/>
@@ -23712,7 +24263,10 @@
     <w:abstractNumId w:val="23"/>
   </w:num>
   <w:num w:numId="42">
-    <w:abstractNumId w:val="38"/>
+    <w:abstractNumId w:val="39"/>
+  </w:num>
+  <w:num w:numId="43">
+    <w:abstractNumId w:val="36"/>
   </w:num>
 </w:numbering>
 </file>
@@ -24519,7 +25073,7 @@
 </file>
 
 <file path=customXml/itemProps1.xml><?xml version="1.0" encoding="utf-8"?>
-<ds:datastoreItem xmlns:ds="http://schemas.openxmlformats.org/officeDocument/2006/customXml" ds:itemID="{BE468FCE-068F-4CF4-B653-9DF85B6AF698}">
+<ds:datastoreItem xmlns:ds="http://schemas.openxmlformats.org/officeDocument/2006/customXml" ds:itemID="{65E45609-17A4-4211-82CD-B0BBF1566F83}">
   <ds:schemaRefs>
     <ds:schemaRef ds:uri="http://schemas.openxmlformats.org/officeDocument/2006/bibliography"/>
   </ds:schemaRefs>

</xml_diff>